<commit_message>
Update Plan de proyecto Nyuron.docx
</commit_message>
<xml_diff>
--- a/Fase 2/Evidencias Proyecto/Plan de proyecto Nyuron.docx
+++ b/Fase 2/Evidencias Proyecto/Plan de proyecto Nyuron.docx
@@ -16414,15 +16414,172 @@
     </w:p>
     <w:p>
       <w:r>
-        <w:t xml:space="preserve">Inserte las imágenes del producto de software desarrollado en los diferentes </w:t>
+        <w:rPr>
+          <w:noProof/>
+        </w:rPr>
+        <w:drawing>
+          <wp:anchor distT="0" distB="0" distL="114300" distR="114300" simplePos="0" relativeHeight="251657216" behindDoc="1" locked="0" layoutInCell="1" allowOverlap="1" wp14:anchorId="28578769" wp14:editId="49D344E2">
+            <wp:simplePos x="0" y="0"/>
+            <wp:positionH relativeFrom="margin">
+              <wp:align>left</wp:align>
+            </wp:positionH>
+            <wp:positionV relativeFrom="paragraph">
+              <wp:posOffset>12700</wp:posOffset>
+            </wp:positionV>
+            <wp:extent cx="1738630" cy="2971800"/>
+            <wp:effectExtent l="0" t="0" r="0" b="0"/>
+            <wp:wrapTight wrapText="bothSides">
+              <wp:wrapPolygon edited="0">
+                <wp:start x="0" y="0"/>
+                <wp:lineTo x="0" y="21462"/>
+                <wp:lineTo x="21300" y="21462"/>
+                <wp:lineTo x="21300" y="0"/>
+                <wp:lineTo x="0" y="0"/>
+              </wp:wrapPolygon>
+            </wp:wrapTight>
+            <wp:docPr id="1503785122" name="Imagen 7"/>
+            <wp:cNvGraphicFramePr>
+              <a:graphicFrameLocks xmlns:a="http://schemas.openxmlformats.org/drawingml/2006/main" noChangeAspect="1"/>
+            </wp:cNvGraphicFramePr>
+            <a:graphic xmlns:a="http://schemas.openxmlformats.org/drawingml/2006/main">
+              <a:graphicData uri="http://schemas.openxmlformats.org/drawingml/2006/picture">
+                <pic:pic xmlns:pic="http://schemas.openxmlformats.org/drawingml/2006/picture">
+                  <pic:nvPicPr>
+                    <pic:cNvPr id="0" name="Picture 3"/>
+                    <pic:cNvPicPr>
+                      <a:picLocks noChangeAspect="1" noChangeArrowheads="1"/>
+                    </pic:cNvPicPr>
+                  </pic:nvPicPr>
+                  <pic:blipFill>
+                    <a:blip r:embed="rId9">
+                      <a:extLst>
+                        <a:ext uri="{28A0092B-C50C-407E-A947-70E740481C1C}">
+                          <a14:useLocalDpi xmlns:a14="http://schemas.microsoft.com/office/drawing/2010/main" val="0"/>
+                        </a:ext>
+                      </a:extLst>
+                    </a:blip>
+                    <a:srcRect/>
+                    <a:stretch>
+                      <a:fillRect/>
+                    </a:stretch>
+                  </pic:blipFill>
+                  <pic:spPr bwMode="auto">
+                    <a:xfrm>
+                      <a:off x="0" y="0"/>
+                      <a:ext cx="1738630" cy="2971800"/>
+                    </a:xfrm>
+                    <a:prstGeom prst="rect">
+                      <a:avLst/>
+                    </a:prstGeom>
+                    <a:noFill/>
+                  </pic:spPr>
+                </pic:pic>
+              </a:graphicData>
+            </a:graphic>
+          </wp:anchor>
+        </w:drawing>
       </w:r>
-      <w:proofErr w:type="spellStart"/>
       <w:r>
-        <w:t>sprints</w:t>
+        <w:rPr>
+          <w:noProof/>
+        </w:rPr>
+        <w:drawing>
+          <wp:inline distT="0" distB="0" distL="0" distR="0" wp14:anchorId="654B86C8" wp14:editId="222AB1D8">
+            <wp:extent cx="1769668" cy="2962275"/>
+            <wp:effectExtent l="0" t="0" r="2540" b="0"/>
+            <wp:docPr id="689850034" name="Imagen 5"/>
+            <wp:cNvGraphicFramePr>
+              <a:graphicFrameLocks xmlns:a="http://schemas.openxmlformats.org/drawingml/2006/main" noChangeAspect="1"/>
+            </wp:cNvGraphicFramePr>
+            <a:graphic xmlns:a="http://schemas.openxmlformats.org/drawingml/2006/main">
+              <a:graphicData uri="http://schemas.openxmlformats.org/drawingml/2006/picture">
+                <pic:pic xmlns:pic="http://schemas.openxmlformats.org/drawingml/2006/picture">
+                  <pic:nvPicPr>
+                    <pic:cNvPr id="0" name="Picture 2"/>
+                    <pic:cNvPicPr>
+                      <a:picLocks noChangeAspect="1" noChangeArrowheads="1"/>
+                    </pic:cNvPicPr>
+                  </pic:nvPicPr>
+                  <pic:blipFill>
+                    <a:blip r:embed="rId10">
+                      <a:extLst>
+                        <a:ext uri="{28A0092B-C50C-407E-A947-70E740481C1C}">
+                          <a14:useLocalDpi xmlns:a14="http://schemas.microsoft.com/office/drawing/2010/main" val="0"/>
+                        </a:ext>
+                      </a:extLst>
+                    </a:blip>
+                    <a:srcRect/>
+                    <a:stretch>
+                      <a:fillRect/>
+                    </a:stretch>
+                  </pic:blipFill>
+                  <pic:spPr bwMode="auto">
+                    <a:xfrm>
+                      <a:off x="0" y="0"/>
+                      <a:ext cx="1784616" cy="2987296"/>
+                    </a:xfrm>
+                    <a:prstGeom prst="rect">
+                      <a:avLst/>
+                    </a:prstGeom>
+                    <a:noFill/>
+                  </pic:spPr>
+                </pic:pic>
+              </a:graphicData>
+            </a:graphic>
+          </wp:inline>
+        </w:drawing>
       </w:r>
-      <w:proofErr w:type="spellEnd"/>
+      <w:r>
+        <w:rPr>
+          <w:noProof/>
+        </w:rPr>
+        <w:drawing>
+          <wp:inline distT="0" distB="0" distL="0" distR="0" wp14:anchorId="18113B16" wp14:editId="0322CA78">
+            <wp:extent cx="3609975" cy="1958975"/>
+            <wp:effectExtent l="0" t="0" r="9525" b="3175"/>
+            <wp:docPr id="447355099" name="Imagen 9" descr="Una captura de pantalla de un celular con letras&#10;&#10;El contenido generado por IA puede ser incorrecto."/>
+            <wp:cNvGraphicFramePr>
+              <a:graphicFrameLocks xmlns:a="http://schemas.openxmlformats.org/drawingml/2006/main" noChangeAspect="1"/>
+            </wp:cNvGraphicFramePr>
+            <a:graphic xmlns:a="http://schemas.openxmlformats.org/drawingml/2006/main">
+              <a:graphicData uri="http://schemas.openxmlformats.org/drawingml/2006/picture">
+                <pic:pic xmlns:pic="http://schemas.openxmlformats.org/drawingml/2006/picture">
+                  <pic:nvPicPr>
+                    <pic:cNvPr id="447355099" name="Imagen 9" descr="Una captura de pantalla de un celular con letras&#10;&#10;El contenido generado por IA puede ser incorrecto."/>
+                    <pic:cNvPicPr>
+                      <a:picLocks noChangeAspect="1" noChangeArrowheads="1"/>
+                    </pic:cNvPicPr>
+                  </pic:nvPicPr>
+                  <pic:blipFill>
+                    <a:blip r:embed="rId11" cstate="print">
+                      <a:extLst>
+                        <a:ext uri="{28A0092B-C50C-407E-A947-70E740481C1C}">
+                          <a14:useLocalDpi xmlns:a14="http://schemas.microsoft.com/office/drawing/2010/main" val="0"/>
+                        </a:ext>
+                      </a:extLst>
+                    </a:blip>
+                    <a:srcRect/>
+                    <a:stretch>
+                      <a:fillRect/>
+                    </a:stretch>
+                  </pic:blipFill>
+                  <pic:spPr bwMode="auto">
+                    <a:xfrm>
+                      <a:off x="0" y="0"/>
+                      <a:ext cx="3677369" cy="1995547"/>
+                    </a:xfrm>
+                    <a:prstGeom prst="rect">
+                      <a:avLst/>
+                    </a:prstGeom>
+                    <a:noFill/>
+                  </pic:spPr>
+                </pic:pic>
+              </a:graphicData>
+            </a:graphic>
+          </wp:inline>
+        </w:drawing>
+      </w:r>
     </w:p>
-    <w:p/>
     <w:p>
       <w:pPr>
         <w:pStyle w:val="Ttulo1"/>
@@ -16430,7 +16587,6 @@
       <w:bookmarkStart w:id="38" w:name="_heading=h.ihv636" w:colFirst="0" w:colLast="0"/>
       <w:bookmarkEnd w:id="38"/>
       <w:r>
-        <w:lastRenderedPageBreak/>
         <w:t>Condiciones de aceptación para cierre del proyecto</w:t>
       </w:r>
     </w:p>
@@ -16542,6 +16698,8 @@
         <w:t>Presentación del proyecto</w:t>
       </w:r>
     </w:p>
+    <w:p/>
+    <w:p/>
     <w:p>
       <w:pPr>
         <w:rPr>
@@ -16560,6 +16718,7 @@
           <w:sz w:val="28"/>
           <w:szCs w:val="28"/>
         </w:rPr>
+        <w:lastRenderedPageBreak/>
         <w:t>Anexos</w:t>
       </w:r>
     </w:p>
@@ -16577,7 +16736,7 @@
         </w:rPr>
         <w:t xml:space="preserve">Anexo 1 – </w:t>
       </w:r>
-      <w:hyperlink r:id="rId9" w:history="1">
+      <w:hyperlink r:id="rId12" w:history="1">
         <w:r>
           <w:rPr>
             <w:rStyle w:val="Hipervnculo"/>
@@ -16609,7 +16768,7 @@
         </w:rPr>
         <w:t xml:space="preserve">Anexo 2 – </w:t>
       </w:r>
-      <w:hyperlink r:id="rId10" w:history="1">
+      <w:hyperlink r:id="rId13" w:history="1">
         <w:r>
           <w:rPr>
             <w:rStyle w:val="Hipervnculo"/>
@@ -16648,7 +16807,7 @@
         </w:rPr>
         <w:t xml:space="preserve"> – </w:t>
       </w:r>
-      <w:hyperlink r:id="rId11" w:history="1">
+      <w:hyperlink r:id="rId14" w:history="1">
         <w:r>
           <w:rPr>
             <w:rStyle w:val="Hipervnculo"/>
@@ -16687,7 +16846,7 @@
         </w:rPr>
         <w:t xml:space="preserve"> – </w:t>
       </w:r>
-      <w:hyperlink r:id="rId12" w:history="1">
+      <w:hyperlink r:id="rId15" w:history="1">
         <w:proofErr w:type="spellStart"/>
         <w:r>
           <w:rPr>
@@ -16758,7 +16917,7 @@
         </w:rPr>
         <w:t xml:space="preserve">Anexo 7 – </w:t>
       </w:r>
-      <w:hyperlink r:id="rId13" w:history="1">
+      <w:hyperlink r:id="rId16" w:history="1">
         <w:r>
           <w:rPr>
             <w:rStyle w:val="Hipervnculo"/>
@@ -16784,7 +16943,7 @@
         </w:rPr>
         <w:t xml:space="preserve">Anexo 8 – </w:t>
       </w:r>
-      <w:hyperlink r:id="rId14" w:history="1">
+      <w:hyperlink r:id="rId17" w:history="1">
         <w:r>
           <w:rPr>
             <w:rStyle w:val="Hipervnculo"/>
@@ -16802,8 +16961,8 @@
       </w:pPr>
     </w:p>
     <w:sectPr>
-      <w:headerReference w:type="default" r:id="rId15"/>
-      <w:footerReference w:type="default" r:id="rId16"/>
+      <w:headerReference w:type="default" r:id="rId18"/>
+      <w:footerReference w:type="default" r:id="rId19"/>
       <w:pgSz w:w="12240" w:h="15840"/>
       <w:pgMar w:top="1418" w:right="1701" w:bottom="1418" w:left="1701" w:header="709" w:footer="709" w:gutter="0"/>
       <w:pgNumType w:start="1"/>

</xml_diff>